<commit_message>
docs(tdd): reconcile TDD version labels to Baseline v2.4
</commit_message>
<xml_diff>
--- a/docs/design/acrme_technical_design_document.docx
+++ b/docs/design/acrme_technical_design_document.docx
@@ -311,7 +311,7 @@
               <w:jc w:val="left"/>
             </w:pPr>
             <w:r>
-              <w:t xml:space="preserve">ADR-001 (region selection), ADR-002 (quota &amp; capacity, single-pool), ADR-003 (capacity during DR), ADR-004 (forecast &amp; increase), ADR-005 (distributed DR reference model) — all v2.3</w:t>
+              <w:t xml:space="preserve">ADR-001 (region selection), ADR-002 (quota &amp; capacity, single-pool), ADR-003 (capacity during DR), ADR-004 (forecast &amp; increase), ADR-005 (distributed DR reference model) — all reconciled to v2.4</w:t>
             </w:r>
           </w:p>
         </w:tc>
@@ -348,7 +348,7 @@
         <w:t xml:space="preserve"> </w:t>
       </w:r>
       <w:r>
-        <w:t xml:space="preserve">ACRME is built — components, runtime, topology, data, state, algorithms, interfaces, security, observability, NFRs, integration, and POC gating — traceable to Requirements Baseline v2.3 and to the companion FDD (which owns the</w:t>
+        <w:t xml:space="preserve">ACRME is built — components, runtime, topology, data, state, algorithms, interfaces, security, observability, NFRs, integration, and POC gating — traceable to Requirements Baseline v2.4 and to the companion FDD (which owns the</w:t>
       </w:r>
       <w:r>
         <w:t xml:space="preserve"> </w:t>
@@ -763,13 +763,13 @@
           <w:bCs/>
           <w:b/>
         </w:rPr>
-        <w:t xml:space="preserve">Reconciliation note (v2.3).</w:t>
-      </w:r>
-      <w:r>
-        <w:t xml:space="preserve"> </w:t>
-      </w:r>
-      <w:r>
-        <w:t xml:space="preserve">This TDD implements the confirmed v2.3 decisions:</w:t>
+        <w:t xml:space="preserve">Reconciliation note (decisions carried into v2.4, first confirmed at v2.3).</w:t>
+      </w:r>
+      <w:r>
+        <w:t xml:space="preserve"> </w:t>
+      </w:r>
+      <w:r>
+        <w:t xml:space="preserve">This TDD implements the following confirmed decisions, unchanged in v2.4:</w:t>
       </w:r>
       <w:r>
         <w:t xml:space="preserve"> </w:t>
@@ -938,7 +938,7 @@
           <w:bCs/>
           <w:b/>
         </w:rPr>
-        <w:t xml:space="preserve">Region model update (v2.3, baseline Section 6).</w:t>
+        <w:t xml:space="preserve">Region model (v2.4, baseline Section 6).</w:t>
       </w:r>
       <w:r>
         <w:t xml:space="preserve"> </w:t>

</xml_diff>